<commit_message>
A7 Unit 6 installed and its practice page built, on Windmill c9c3e8a (Croix: "Fix it. I give you permission") — the kit gives a wrapping IXL skill name the rows it needs, so T-B1 slide 35 no longer overprints and build_all.py u6 --install ran at 0 gate and 0 check findings (161 files, 13 zips, the question bank reference); master sheet regenerated, 0 problems. The practice page and the teacher copy built by run.py after every check: u6_check sound on 3,000 sets, verify, 31 of 31 planted errors caught, the lock, the variety floor, the kit's browser check. The teacher copy prints the test as random sets with the paper's shape: no set number on a student's sheet, points on the head, sections and parts, the follow-through line, the key with its set number and the score tracker. Both kits vendored at c9c3e8a; NOTES.md brought up to date.
Co-Authored-By: Claude Opus 5.5 <noreply@anthropic.com>
Claude-Session: https://claude.ai/code/session_018Be467MLKJu6DjkSsjpM7D
</commit_message>
<xml_diff>
--- a/a7/packages/A7 Unit 6 - Relationships in Triangles/Lessons/6.01/A7 6.01 Triangle Inequality Theorem; Converse of the Pythagorean Theorem - Additional Question Bank.docx
+++ b/a7/packages/A7 Unit 6 - Relationships in Triangles/Lessons/6.01/A7 6.01 Triangle Inequality Theorem; Converse of the Pythagorean Theorem - Additional Question Bank.docx
@@ -323,7 +323,7 @@
                 <w:color w:val="1A1A1A"/>
                 <w:sz w:val="22"/>
               </w:rPr>
-              <w:t>6 in, 17 in, 9 in</w:t>
+              <w:t>6 inches, 17 inches, 9 inches</w:t>
             </w:r>
           </w:p>
           <w:p>
@@ -428,7 +428,7 @@
           <w:color w:val="1A1A1A"/>
           <w:sz w:val="22"/>
         </w:rPr>
-        <w:t>For questions 4 and 5, two sides are given. What lengths can the third side be?</w:t>
+        <w:t>For questions 4 and 5, two sides of a triangle are given. Write an inequality for the third side, x.</w:t>
       </w:r>
     </w:p>
     <w:tbl>
@@ -554,7 +554,7 @@
                 <w:color w:val="1A1A1A"/>
                 <w:sz w:val="22"/>
               </w:rPr>
-              <w:t>1 in and 8 in; the third side is a whole number of inches</w:t>
+              <w:t>1 inch and 8 inches; the third side is a whole number of inches — which one?</w:t>
             </w:r>
           </w:p>
           <w:p>
@@ -713,7 +713,7 @@
                 <w:color w:val="1A1A1A"/>
                 <w:sz w:val="22"/>
               </w:rPr>
-              <w:t>39 in, 36 in, 15 in</w:t>
+              <w:t>39 inches, 36 inches, 15 inches</w:t>
             </w:r>
           </w:p>
           <w:p>

</xml_diff>